<commit_message>
Cut rule noise, protect citations, add copy buttons to Ask
- Remove the capital-after-colon rule: mostly false positives on names
  and labels in real documents (106 rules total).
- Long-sentence rule now fires at 35 words or more.
- Numbers, dates, punctuation and spelling rules leave URLs, DOIs,
  ISBNs and volume(issue):pages alone. Ask was turning 59(1) into
  59(one) and putting commas into DOIs.
- Check a document skips text under a References heading and says so.
- Short-form-not-expanded recognises lower-case, hyphenated and
  bracketed definitions, and ignores headings, contents lines and
  glossary rows.
- Ask answers get Copy for Word and Copy as text buttons.
- Sample briefing says 'for demonstration purposes'.

Co-Authored-By: Claude Opus 5.5 <noreply@anthropic.com>
</commit_message>
<xml_diff>
--- a/tests/sample - annotated.docx
+++ b/tests/sample - annotated.docx
@@ -440,7 +440,7 @@
 
 <file path=word/comments.xml><?xml version="1.0" encoding="utf-8"?>
 <w:comments xmlns:w="http://schemas.openxmlformats.org/wordprocessingml/2006/main" xmlns:r="http://schemas.openxmlformats.org/officeDocument/2006/relationships">
-  <w:comment w:id="0" w:author="Style Manual Check" w:initials="SMC" w:date="2026-08-22T11:04:28Z">
+  <w:comment w:id="0" w:author="Style Manual Check" w:initials="SMC" w:date="2026-10-28T04:18:07Z">
     <w:p>
       <w:pPr>
         <w:pStyle w:val="CommentText"/>
@@ -600,7 +600,7 @@
       </w:hyperlink>
     </w:p>
   </w:comment>
-  <w:comment w:id="1" w:author="Style Manual Check" w:initials="SMC" w:date="2026-08-22T11:04:28Z">
+  <w:comment w:id="1" w:author="Style Manual Check" w:initials="SMC" w:date="2026-10-28T04:18:07Z">
     <w:p>
       <w:pPr>
         <w:pStyle w:val="CommentText"/>
@@ -644,7 +644,7 @@
       </w:hyperlink>
     </w:p>
   </w:comment>
-  <w:comment w:id="2" w:author="Style Manual Check" w:initials="SMC" w:date="2026-08-22T11:04:28Z">
+  <w:comment w:id="2" w:author="Style Manual Check" w:initials="SMC" w:date="2026-10-28T04:18:07Z">
     <w:p>
       <w:pPr>
         <w:pStyle w:val="CommentText"/>
@@ -688,7 +688,7 @@
       </w:hyperlink>
     </w:p>
   </w:comment>
-  <w:comment w:id="3" w:author="Style Manual Check" w:initials="SMC" w:date="2026-08-22T11:04:28Z">
+  <w:comment w:id="3" w:author="Style Manual Check" w:initials="SMC" w:date="2026-10-28T04:18:07Z">
     <w:p>
       <w:pPr>
         <w:pStyle w:val="CommentText"/>
@@ -732,7 +732,7 @@
       </w:hyperlink>
     </w:p>
   </w:comment>
-  <w:comment w:id="4" w:author="Style Manual Check" w:initials="SMC" w:date="2026-08-22T11:04:28Z">
+  <w:comment w:id="4" w:author="Style Manual Check" w:initials="SMC" w:date="2026-10-28T04:18:07Z">
     <w:p>
       <w:pPr>
         <w:pStyle w:val="CommentText"/>
@@ -776,7 +776,7 @@
       </w:hyperlink>
     </w:p>
   </w:comment>
-  <w:comment w:id="5" w:author="Style Manual Check" w:initials="SMC" w:date="2026-08-22T11:04:28Z">
+  <w:comment w:id="5" w:author="Style Manual Check" w:initials="SMC" w:date="2026-10-28T04:18:07Z">
     <w:p>
       <w:pPr>
         <w:pStyle w:val="CommentText"/>
@@ -820,7 +820,7 @@
       </w:hyperlink>
     </w:p>
   </w:comment>
-  <w:comment w:id="6" w:author="Style Manual Check" w:initials="SMC" w:date="2026-08-22T11:04:28Z">
+  <w:comment w:id="6" w:author="Style Manual Check" w:initials="SMC" w:date="2026-10-28T04:18:07Z">
     <w:p>
       <w:pPr>
         <w:pStyle w:val="CommentText"/>
@@ -864,7 +864,7 @@
       </w:hyperlink>
     </w:p>
   </w:comment>
-  <w:comment w:id="7" w:author="Style Manual Check" w:initials="SMC" w:date="2026-08-22T11:04:28Z">
+  <w:comment w:id="7" w:author="Style Manual Check" w:initials="SMC" w:date="2026-10-28T04:18:07Z">
     <w:p>
       <w:pPr>
         <w:pStyle w:val="CommentText"/>
@@ -908,7 +908,7 @@
       </w:hyperlink>
     </w:p>
   </w:comment>
-  <w:comment w:id="8" w:author="Style Manual Check" w:initials="SMC" w:date="2026-08-22T11:04:28Z">
+  <w:comment w:id="8" w:author="Style Manual Check" w:initials="SMC" w:date="2026-10-28T04:18:07Z">
     <w:p>
       <w:pPr>
         <w:pStyle w:val="CommentText"/>
@@ -952,7 +952,7 @@
       </w:hyperlink>
     </w:p>
   </w:comment>
-  <w:comment w:id="9" w:author="Style Manual Check" w:initials="SMC" w:date="2026-08-22T11:04:28Z">
+  <w:comment w:id="9" w:author="Style Manual Check" w:initials="SMC" w:date="2026-10-28T04:18:07Z">
     <w:p>
       <w:pPr>
         <w:pStyle w:val="CommentText"/>
@@ -996,7 +996,7 @@
       </w:hyperlink>
     </w:p>
   </w:comment>
-  <w:comment w:id="10" w:author="Style Manual Check" w:initials="SMC" w:date="2026-08-22T11:04:28Z">
+  <w:comment w:id="10" w:author="Style Manual Check" w:initials="SMC" w:date="2026-10-28T04:18:07Z">
     <w:p>
       <w:pPr>
         <w:pStyle w:val="CommentText"/>
@@ -1040,7 +1040,7 @@
       </w:hyperlink>
     </w:p>
   </w:comment>
-  <w:comment w:id="11" w:author="Style Manual Check" w:initials="SMC" w:date="2026-08-22T11:04:28Z">
+  <w:comment w:id="11" w:author="Style Manual Check" w:initials="SMC" w:date="2026-10-28T04:18:07Z">
     <w:p>
       <w:pPr>
         <w:pStyle w:val="CommentText"/>
@@ -1084,7 +1084,7 @@
       </w:hyperlink>
     </w:p>
   </w:comment>
-  <w:comment w:id="12" w:author="Style Manual Check" w:initials="SMC" w:date="2026-08-22T11:04:28Z">
+  <w:comment w:id="12" w:author="Style Manual Check" w:initials="SMC" w:date="2026-10-28T04:18:07Z">
     <w:p>
       <w:pPr>
         <w:pStyle w:val="CommentText"/>
@@ -1178,7 +1178,7 @@
       </w:hyperlink>
     </w:p>
   </w:comment>
-  <w:comment w:id="13" w:author="Style Manual Check" w:initials="SMC" w:date="2026-08-22T11:04:28Z">
+  <w:comment w:id="13" w:author="Style Manual Check" w:initials="SMC" w:date="2026-10-28T04:18:07Z">
     <w:p>
       <w:pPr>
         <w:pStyle w:val="CommentText"/>
@@ -1222,7 +1222,7 @@
       </w:hyperlink>
     </w:p>
   </w:comment>
-  <w:comment w:id="14" w:author="Style Manual Check" w:initials="SMC" w:date="2026-08-22T11:04:28Z">
+  <w:comment w:id="14" w:author="Style Manual Check" w:initials="SMC" w:date="2026-10-28T04:18:07Z">
     <w:p>
       <w:pPr>
         <w:pStyle w:val="CommentText"/>
@@ -1266,7 +1266,7 @@
       </w:hyperlink>
     </w:p>
   </w:comment>
-  <w:comment w:id="15" w:author="Style Manual Check" w:initials="SMC" w:date="2026-08-22T11:04:28Z">
+  <w:comment w:id="15" w:author="Style Manual Check" w:initials="SMC" w:date="2026-10-28T04:18:07Z">
     <w:p>
       <w:pPr>
         <w:pStyle w:val="CommentText"/>
@@ -1310,7 +1310,7 @@
       </w:hyperlink>
     </w:p>
   </w:comment>
-  <w:comment w:id="16" w:author="Style Manual Check" w:initials="SMC" w:date="2026-08-22T11:04:28Z">
+  <w:comment w:id="16" w:author="Style Manual Check" w:initials="SMC" w:date="2026-10-28T04:18:07Z">
     <w:p>
       <w:pPr>
         <w:pStyle w:val="CommentText"/>
@@ -1354,7 +1354,7 @@
       </w:hyperlink>
     </w:p>
   </w:comment>
-  <w:comment w:id="17" w:author="Style Manual Check" w:initials="SMC" w:date="2026-08-22T11:04:28Z">
+  <w:comment w:id="17" w:author="Style Manual Check" w:initials="SMC" w:date="2026-10-28T04:18:07Z">
     <w:p>
       <w:pPr>
         <w:pStyle w:val="CommentText"/>
@@ -1434,7 +1434,7 @@
       </w:hyperlink>
     </w:p>
   </w:comment>
-  <w:comment w:id="18" w:author="Style Manual Check" w:initials="SMC" w:date="2026-08-22T11:04:28Z">
+  <w:comment w:id="18" w:author="Style Manual Check" w:initials="SMC" w:date="2026-10-28T04:18:07Z">
     <w:p>
       <w:pPr>
         <w:pStyle w:val="CommentText"/>
@@ -1478,7 +1478,7 @@
       </w:hyperlink>
     </w:p>
   </w:comment>
-  <w:comment w:id="19" w:author="Style Manual Check" w:initials="SMC" w:date="2026-08-22T11:04:28Z">
+  <w:comment w:id="19" w:author="Style Manual Check" w:initials="SMC" w:date="2026-10-28T04:18:07Z">
     <w:p>
       <w:pPr>
         <w:pStyle w:val="CommentText"/>
@@ -1522,7 +1522,7 @@
       </w:hyperlink>
     </w:p>
   </w:comment>
-  <w:comment w:id="20" w:author="Style Manual Check" w:initials="SMC" w:date="2026-08-22T11:04:28Z">
+  <w:comment w:id="20" w:author="Style Manual Check" w:initials="SMC" w:date="2026-10-28T04:18:07Z">
     <w:p>
       <w:pPr>
         <w:pStyle w:val="CommentText"/>
@@ -1566,7 +1566,7 @@
       </w:hyperlink>
     </w:p>
   </w:comment>
-  <w:comment w:id="21" w:author="Style Manual Check" w:initials="SMC" w:date="2026-08-22T11:04:28Z">
+  <w:comment w:id="21" w:author="Style Manual Check" w:initials="SMC" w:date="2026-10-28T04:18:07Z">
     <w:p>
       <w:pPr>
         <w:pStyle w:val="CommentText"/>
@@ -1610,7 +1610,7 @@
       </w:hyperlink>
     </w:p>
   </w:comment>
-  <w:comment w:id="22" w:author="Style Manual Check" w:initials="SMC" w:date="2026-08-22T11:04:28Z">
+  <w:comment w:id="22" w:author="Style Manual Check" w:initials="SMC" w:date="2026-10-28T04:18:07Z">
     <w:p>
       <w:pPr>
         <w:pStyle w:val="CommentText"/>
@@ -1654,7 +1654,7 @@
       </w:hyperlink>
     </w:p>
   </w:comment>
-  <w:comment w:id="23" w:author="Style Manual Check" w:initials="SMC" w:date="2026-08-22T11:04:28Z">
+  <w:comment w:id="23" w:author="Style Manual Check" w:initials="SMC" w:date="2026-10-28T04:18:07Z">
     <w:p>
       <w:pPr>
         <w:pStyle w:val="CommentText"/>
@@ -1698,7 +1698,7 @@
       </w:hyperlink>
     </w:p>
   </w:comment>
-  <w:comment w:id="24" w:author="Style Manual Check" w:initials="SMC" w:date="2026-08-22T11:04:28Z">
+  <w:comment w:id="24" w:author="Style Manual Check" w:initials="SMC" w:date="2026-10-28T04:18:07Z">
     <w:p>
       <w:pPr>
         <w:pStyle w:val="CommentText"/>
@@ -1742,7 +1742,7 @@
       </w:hyperlink>
     </w:p>
   </w:comment>
-  <w:comment w:id="25" w:author="Style Manual Check" w:initials="SMC" w:date="2026-08-22T11:04:28Z">
+  <w:comment w:id="25" w:author="Style Manual Check" w:initials="SMC" w:date="2026-10-28T04:18:07Z">
     <w:p>
       <w:pPr>
         <w:pStyle w:val="CommentText"/>

</xml_diff>